<commit_message>
Elul 5784 Full Sefer
</commit_message>
<xml_diff>
--- a/Files/06 - Yom Tov/08 - Elul/5784/Elul 5784.docx
+++ b/Files/06 - Yom Tov/08 - Elul/5784/Elul 5784.docx
@@ -144,7 +144,7 @@
           <w:rFonts w:ascii="Times New Roman" w:hAnsi="Times New Roman" w:cs="Times New Roman"/>
           <w:rtl/>
         </w:rPr>
-        <w:t> </w:t>
+        <w:t xml:space="preserve"> </w:t>
       </w:r>
       <w:r>
         <w:rPr>
@@ -230,7 +230,7 @@
           <w:rFonts w:ascii="Times New Roman" w:hAnsi="Times New Roman" w:cs="Times New Roman"/>
           <w:rtl/>
         </w:rPr>
-        <w:t> </w:t>
+        <w:t xml:space="preserve"> </w:t>
       </w:r>
       <w:r>
         <w:rPr>
@@ -823,7 +823,7 @@
           <w:rFonts w:ascii="Times New Roman" w:hAnsi="Times New Roman" w:cs="Times New Roman"/>
           <w:rtl/>
         </w:rPr>
-        <w:t> </w:t>
+        <w:t xml:space="preserve"> </w:t>
       </w:r>
       <w:r>
         <w:rPr>
@@ -1757,7 +1757,7 @@
         <w:rPr>
           <w:rFonts w:ascii="Times New Roman" w:hAnsi="Times New Roman" w:cs="Times New Roman"/>
         </w:rPr>
-        <w:t>’s not</w:t>
+        <w:t xml:space="preserve">’s not </w:t>
       </w:r>
       <w:r>
         <w:rPr>
@@ -1832,7 +1832,7 @@
           <w:rFonts w:ascii="Times New Roman" w:hAnsi="Times New Roman" w:cs="Times New Roman"/>
           <w:rtl/>
         </w:rPr>
-        <w:t> </w:t>
+        <w:t xml:space="preserve"> </w:t>
       </w:r>
       <w:r>
         <w:rPr>

</xml_diff>

<commit_message>
Elul 5784 Fix Full Sefer
</commit_message>
<xml_diff>
--- a/Files/06 - Yom Tov/08 - Elul/5784/Elul 5784.docx
+++ b/Files/06 - Yom Tov/08 - Elul/5784/Elul 5784.docx
@@ -144,7 +144,7 @@
           <w:rFonts w:ascii="Times New Roman" w:hAnsi="Times New Roman" w:cs="Times New Roman"/>
           <w:rtl/>
         </w:rPr>
-        <w:t> </w:t>
+        <w:t xml:space="preserve"> </w:t>
       </w:r>
       <w:r>
         <w:rPr>
@@ -230,7 +230,7 @@
           <w:rFonts w:ascii="Times New Roman" w:hAnsi="Times New Roman" w:cs="Times New Roman"/>
           <w:rtl/>
         </w:rPr>
-        <w:t> </w:t>
+        <w:t xml:space="preserve"> </w:t>
       </w:r>
       <w:r>
         <w:rPr>
@@ -823,7 +823,7 @@
           <w:rFonts w:ascii="Times New Roman" w:hAnsi="Times New Roman" w:cs="Times New Roman"/>
           <w:rtl/>
         </w:rPr>
-        <w:t> </w:t>
+        <w:t xml:space="preserve"> </w:t>
       </w:r>
       <w:r>
         <w:rPr>
@@ -1763,7 +1763,7 @@
         <w:rPr>
           <w:rFonts w:ascii="Times New Roman" w:hAnsi="Times New Roman" w:cs="Times New Roman"/>
         </w:rPr>
-        <w:t>s not</w:t>
+        <w:t xml:space="preserve">s not </w:t>
       </w:r>
       <w:r>
         <w:rPr>
@@ -1838,7 +1838,7 @@
           <w:rFonts w:ascii="Times New Roman" w:hAnsi="Times New Roman" w:cs="Times New Roman"/>
           <w:rtl/>
         </w:rPr>
-        <w:t> </w:t>
+        <w:t xml:space="preserve"> </w:t>
       </w:r>
       <w:r>
         <w:rPr>

</xml_diff>